<commit_message>
fix(ai): benchmark_engines hard-code duong dan Tesseract, vi pham NFR-M4
`dung_tesseract()` ghi cung `C:\Program Files\Tesseract-OCR\tesseract.exe`.
Hai hau qua:
* tests/test_architecture.py::TestNoHardCodedPaths[ai] DO — bo kiem thu that su
  co 1 test hong, trong khi quyen cong bo "0 fail".
* Duong dan do chi dung tren mot may Windows cai theo mac dinh; tren Linux hoac
  may cai bang scoop/choco thi ham im lang bo qua va Tesseract chay sai binary.

Sua: tim theo thu tu bien moi truong ALPR_TESSERACT_CMD -> shutil.which
("tesseract") -> mac dinh cua pytesseract.

Kem cap nhat so lieu kiem thu trong quyen va slide: 1.001 thu thap / 1.000 dat
-> **1.002 / 1.001** (1 xfail, 0 hong). Bo so cu la luot do 02/08, truoc khi
benchmark_engines.py duoc them vao.

Chay lai: pytest 1.001 passed, 1 xfailed, 0 failed. ruff + black sach tren tep
vua sua. check_thesis_refs 94 tham chieu, 0 chet.

Co-Authored-By: Claude Opus 5 <noreply@anthropic.com>
</commit_message>
<xml_diff>
--- a/docs/papers/compact/thesis-full.docx
+++ b/docs/papers/compact/thesis-full.docx
@@ -4645,7 +4645,7 @@
           <w:b/>
           <w:bCs/>
         </w:rPr>
-        <w:t xml:space="preserve">1.001 test thu thập / 1.000 đạt / 1</w:t>
+        <w:t xml:space="preserve">1.002 test thu thập / 1.001 đạt / 1</w:t>
       </w:r>
       <w:r>
         <w:rPr>
@@ -44926,7 +44926,7 @@
           <w:b/>
           <w:bCs/>
         </w:rPr>
-        <w:t xml:space="preserve">1.000/1.001</w:t>
+        <w:t xml:space="preserve">1.001/1.002</w:t>
       </w:r>
       <w:r>
         <w:t xml:space="preserve"> </w:t>

</xml_diff>